<commit_message>
grammar fixes + AAAI review report + revision plan
Grammar: 9 minimal fixes (迫使→引导, 证实→表明, etc.)
New: docs/review_issues_and_revision_plan.md
- 17 specific issues across 5 categories
- Root cause analysis (5 systemic issues)
- 4-step revision plan with priorities
- Process improvements for future work
</commit_message>
<xml_diff>
--- a/docs/论文初稿_v7_cn.docx
+++ b/docs/论文初稿_v7_cn.docx
@@ -71,7 +71,7 @@
     </w:p>
     <w:p>
       <w:r>
-        <w:t>这种空白并非偶然。儿童语音的声学特性与成人存在根本差异——基频更高（平均 F0 约 496 Hz，成人 80—220 Hz）、韵律变异性更大、情绪信息的时间分布模式不同。这些差异造成了分布偏移，使得在成人语音上预训练的 SSL 模型直接应用于儿童时性能下降。</w:t>
+        <w:t>这种空白并非偶然。儿童语音的声学特性与成人存在根本性差异——基频更高（平均 F0 约 496 Hz，成人 80—220 Hz）、韵律变异性更大、情绪信息的时间分布模式不同。这些差异造成了分布偏移，使得在成人语音上预训练的 SSL 模型直接应用于儿童时性能下降。</w:t>
       </w:r>
     </w:p>
     <w:p>
@@ -91,7 +91,7 @@
     </w:p>
     <w:p>
       <w:r>
-        <w:t>本文核心发现包括：（1）韵律池化对儿童增益远大于成人，且受录音风格调节；（2）FD ∝ 1/准确率在三个维度上严格单调；（3）注意力熵与逐类准确率负相关，为机制提供可解释性。</w:t>
+        <w:t>本文核心发现包括：（1）韵律池化对儿童增益远大于成人，且效果与情绪产生方式有关；（2）FD ∝ 1/准确率在三个维度上严格单调；（3）注意力熵与逐类准确率负相关，为机制提供可解释性。</w:t>
       </w:r>
     </w:p>
     <w:p>
@@ -198,7 +198,7 @@
     </w:p>
     <w:p>
       <w:r>
-        <w:t>核心设计选择是将韵律信息显式注入注意力机制，而非让模型纯粹从 SSL 特征中学习注意力。这迫使模型基于韵律内容关注帧——这正是儿童语音情绪信息的集中位置。输入前对 F0 和 energy 分别归一化到 [0, 1] 区间。</w:t>
+        <w:t>核心设计选择是将韵律信息显式注入注意力机制，而非让模型纯粹从 SSL 特征中学习注意力。这引导模型基于韵律内容关注帧——儿童语音的情绪信息正集中在这些帧上。输入前对 F0 和 energy 分别归一化到 [0, 1] 区间。</w:t>
       </w:r>
     </w:p>
     <w:p>
@@ -656,7 +656,7 @@
     <w:p/>
     <w:p>
       <w:r>
-        <w:t>MFCC+CNN 基线在严格说话人独立评估下仅达 50.2%，暗示已发表的 76% 可能存在说话人重叠导致的数据泄露。仅 WavLM 替代手工特征即带来约 28pp 提升。韵律池化在 WavLM 基础上额外贡献 2.2pp。Adapter 仅贡献约 0.6pp，且在不同运行间不稳定，因此不纳入推荐模型。</w:t>
+        <w:t>MFCC+CNN 基线在严格说话人独立评估下仅达 50.2%，提示已发表的 76% 可能来自非严格说话人独立的评估。仅 WavLM 替代手工特征即带来约 28pp 提升。韵律池化在 WavLM 基础上额外贡献 2.2pp。Adapter 仅贡献约 0.6pp，且在不同运行间不稳定，因此不纳入推荐模型。</w:t>
       </w:r>
     </w:p>
     <w:p>
@@ -1083,7 +1083,7 @@
     <w:p/>
     <w:p>
       <w:r>
-        <w:t>观察：在情绪被指定表达的两个数据集（C-BESD、CREMA-D）上，韵律池化均表现为正向增益，且儿童获益远大于成人（+2.24 vs +0.75 percentage points）。而在情绪于对话中自然流露的 IEMOCAP 上，韵律池化有轻微的负向效果。这提示韵律引导注意力的有效性取决于语音中情绪韵律线索的显著性与规律性——指定表达时韵律模式更清晰可辨，自然对话中情绪韵律更细微分散。</w:t>
+        <w:t>观察：在情绪被指定表达的两个数据集（C-BESD、CREMA-D）上，韵律池化均表现为正向增益，且儿童获益远大于成人（+2.24 vs +0.75 percentage points）。而在情绪于对话中自然流露的 IEMOCAP 上，韵律池化有小幅的负向效果。这提示韵律引导注意力的有效性取决于语音中情绪韵律线索的显著性与规律性——指定表达时韵律模式更清晰可辨，自然对话中情绪韵律更细微分散。</w:t>
       </w:r>
     </w:p>
     <w:p>
@@ -1678,7 +1678,7 @@
     <w:p/>
     <w:p>
       <w:r>
-        <w:t>所有增强均有害，即使使用由儿童统计分布约束的参数。FD 与准确率的单调关系证实分布偏移可定量预测性能退化。</w:t>
+        <w:t>所有增强均有害，即使使用由儿童统计分布约束的参数。FD 与准确率的单调关系表明，在当前实验条件下，分布偏移可定量关联性能退化。</w:t>
       </w:r>
     </w:p>
     <w:p>
@@ -1907,7 +1907,7 @@
     <w:p/>
     <w:p>
       <w:r>
-        <w:t>语言偏移导致分类几乎完全失效（EN→TE 仅略高于随机水平）。英语与泰卢固语的 FD 高达约 137——比增强引起的 FD 大两个数量级——解释了跨语言迁移的极端退化。</w:t>
+        <w:t>语言偏移导致分类几乎完全失效（EN→TE 仅略高于随机水平）。英语与泰卢固语的 FD 估计约为 137——远超增强引起的 FD（0~12）——解释了跨语言迁移的极端退化。</w:t>
       </w:r>
     </w:p>
     <w:p>
@@ -2400,7 +2400,7 @@
     <w:p/>
     <w:p>
       <w:r>
-        <w:t>注意力熵（越低 = 注意力越集中）与逐类准确率呈负相关。具有时间集中韵律线索的情绪（ANGER、FEAR）从韵律引导注意力中获益更多，而线索分散的情绪（HAPPY、NEUTRAL）获益较少。</w:t>
+        <w:t>注意力熵（越低 = 注意力越集中）与逐类准确率呈负相关趋势（6 类，Pearson r 待补充）。具有时间集中韵律线索的情绪（ANGER、FEAR）从韵律引导注意力中获益更多，而线索分散的情绪（HAPPY、NEUTRAL）获益较少。</w:t>
       </w:r>
     </w:p>
     <w:p>
@@ -2465,7 +2465,7 @@
     </w:p>
     <w:p>
       <w:r>
-        <w:t>本文首次系统性地将 SSL 模型与儿童 SER 结合。韵律引导时序池化在 C-BESD 上达到 80.85%，显著超过已发表基线。跨数据集实验揭示了韵律池化效果受说话人年龄和录音风格共同调节——这一细致发现挑战了简单的成人到儿童迁移假设。统一的 FD-准确率框架为理解和预测三个正交维度上的分布偏移导致的性能退化提供了定量工具。我们希望本研究能引起对儿童 SER 这一欠探索领域的关注，并为未来研究提供基础。</w:t>
+        <w:t>本文首次系统性地将 SSL 模型与儿童 SER 结合。韵律引导时序池化在 C-BESD 上达到 80.85%，显著超过已发表基线。跨数据集实验揭示了韵律池化效果与说话人年龄和情绪产生方式两个因素相关——这表明成人 SER 方法不能简单地直接迁移到儿童语音上。统一的 FD-准确率框架为理解和预测三个正交维度上的分布偏移导致的性能退化提供了定量工具。我们希望本研究能引起对儿童 SER 这一欠探索领域的关注，并为未来研究提供基础。</w:t>
       </w:r>
     </w:p>
     <w:p>

</xml_diff>

<commit_message>
v7 major revision: unified narrative, downgrade claims, fix logic gaps
Rewrites:
- Abstract: FD framework as main thread, all strong claims downgraded
- Introduction: problem-driven structure (shift→FD→method→boundary)
- Added A3/B3 selection logic, IEMOCAP label mapping, cross-language caveat

Language downgrades (9 fixes + systemic changes):
- 首次/空白→据我们所知
- 证实/揭示→表明/提示/趋势
- 预测工具→风险指标
- 数据泄露→协议不可直接比较
- 所有增强均有害→本实验条件下显著下降

Updated revision plan with completion status.
</commit_message>
<xml_diff>
--- a/docs/论文初稿_v7_cn.docx
+++ b/docs/论文初稿_v7_cn.docx
@@ -40,7 +40,7 @@
     </w:p>
     <w:p>
       <w:r>
-        <w:t>儿童语音情绪识别（SER）与成人 SER 相比严重滞后，尤其在自监督预训练（SSL）模型的应用方面。本文首次系统性地将 SSL 特征与儿童 SER 结合，提出了一种轻量级韵律引导时序池化方法和多维度分布偏移量化框架。在 C-BESD 双语儿童数据集上，严格说话人独立评估下达到 80.85% WA / 80.8% UAR，远超复现的 MFCC+CNN 基线（50.2%）和已有文献报告的 76%。跨数据集实验揭示了年龄与录音风格的交叉效应：韵律池化对儿童脚本化语音增益最大（+2.24pp），对成人脚本化语音有中等增益（CREMA-D: +0.75pp），但对成人自发性语音反而有害（IEMOCAP: −2.12pp）。进一步地，我们使用 Fréchet 距离量化了三个正交维度的分布偏移（年龄、增强、语言），揭示了 FD 与分类准确率之间严格的单调关系。逐类注意力分析显示注意力熵与分类准确率负相关，为时序注意力机制提供了可解释性。所有实验均采用严格的说话人独立划分与多种子验证。</w:t>
+        <w:t>儿童语音情绪识别（SER）在自监督预训练（SSL）模型时代仍然远落后于成人 SER。本文以 C-BESD 双语儿童数据集为核心，研究冻结 SSL 表征在严格说话人独立评估下面对的分布偏移问题。据我们所知，本文是首个在 C-BESD 上系统评估冻结 SSL 表征、严格说话人独立划分与儿童 SER 的工作。我们分析了三类分布偏移——年龄（儿童 vs 成人）、数据增强（原始 vs 扰动）和语言（英语 vs 泰卢固语）——并使用 Fréchet 距离（FD）对其进行量化，观察到 FD 与准确率退化之间的一致单调趋势。基于儿童语音情绪信息时间分布不均的观察，我们提出了一种轻量的韵律引导时序池化方法，在 C-BESD 上达到 80.9% WA / 80.8% UAR（3 seeds, 均值±标准差）。跨数据集对比显示，韵律池化对儿童指定表达语音增益最大（+2.24 个百分点），对成人指定表达语音有较小增益（CREMA-D: +0.75 个百分点），但对成人自然对话语音效果为负（IEMOCAP: −2.12 个百分点），提示韵律引导的有效性与说话人年龄及情绪产生方式两个因素相关。逐类注意力分析显示注意力熵与分类准确率呈负相关趋势。所有实验均采用严格的说话人独立划分与多种子验证。</w:t>
       </w:r>
     </w:p>
     <w:p>
@@ -66,32 +66,32 @@
     </w:p>
     <w:p>
       <w:r>
-        <w:t>语音情绪识别（SER）在 WavLM、HuBERT、wav2vec 2.0 等大规模 SSL 模型的推动下取得了长足进步。然而，这些进步几乎完全局限于成人语音领域。儿童 SER 是一个显著的研究空白：据我们所知，尚无已发表工作将 SSL 预训练模型与儿童 SER 在严格说话人独立评估下结合。现有儿童 SER 研究主要使用传统手工特征和浅层分类器 [5]，或探索成人到儿童的跨年龄迁移但不使用现代 SSL 骨干 [6]。成人 SER 中 SSL 模型已成标配 [1,2]，但这一技术路线尚未系统性地进入儿童语音领域。</w:t>
+        <w:t>语音情绪识别（SER）在 WavLM、HuBERT、wav2vec 2.0 等大规模 SSL 模型的推动下取得了长足进步。然而，这些进步几乎完全局限于成人语音领域。据我们所知，尚无已发表工作在严格的说话人独立评估下将冻结 SSL 表征与儿童 SER 结合。现有儿童 SER 研究主要使用传统手工特征和浅层分类器 [5]，或探索成人到儿童的跨年龄迁移但不使用现代 SSL 骨干 [6]。成人 SER 中 SSL 模型已成标配 [1,2]，但这一技术路线尚未进入儿童语音领域。</w:t>
       </w:r>
     </w:p>
     <w:p>
       <w:r>
-        <w:t>这种空白并非偶然。儿童语音的声学特性与成人存在根本性差异——基频更高（平均 F0 约 496 Hz，成人 80—220 Hz）、韵律变异性更大、情绪信息的时间分布模式不同。这些差异造成了分布偏移，使得在成人语音上预训练的 SSL 模型直接应用于儿童时性能下降。</w:t>
+        <w:t>儿童语音的声学特性与成人存在根本性差异——基频更高、韵律变异性更大、情绪信息的时间分布模式不同。这些差异造成了分布偏移，使得在成人语音上预训练的 SSL 模型直接应用于儿童时性能下降。本文的核心问题是：冻结 SSL 表征在儿童 SER 中面对哪些分布偏移？这些偏移如何影响分类性能？能否用一个统一框架来量化和理解这些影响？</w:t>
       </w:r>
     </w:p>
     <w:p>
       <w:r>
-        <w:t>本文从两条线索回应上述空白：</w:t>
+        <w:t>围绕这一问题，本文的贡献分为三个层面：</w:t>
       </w:r>
     </w:p>
     <w:p>
       <w:r>
-        <w:t>方法层面，我们提出韵律引导的时序重要性池化（Prosody-guided Temporal Importance Pooling）——一种利用帧级基频（F0）和能量引导帧级注意力加权的轻量机制。与将各帧等权处理的均值池化不同，该方法基于"儿童语音的情绪信息在时间上非均匀分布，集中于韵律突变帧"这一核心发现。</w:t>
+        <w:t>分布偏移分析：我们使用 Fréchet 距离（FD）量化了三类分布偏移——年龄（儿童 vs 成人）、数据增强（原始 vs 扰动后）和语言（英语 vs 泰卢固语）。在观察到的三个维度上，FD 与分类准确率退化之间表现出一致的单调趋势，提示 FD 可作为分布偏移风险指标。</w:t>
       </w:r>
     </w:p>
     <w:p>
       <w:r>
-        <w:t>分析层面，我们提出统一的分布偏移量化框架，使用 Fréchet 距离（FD）测量三个正交维度的偏移——年龄（儿童 vs 成人）、增强（clean vs 扰动）、语言（英语 vs 泰卢固语）——并证明 FD 与分类准确率在所有维度上均呈严格单调关系。</w:t>
+        <w:t>方法响应：基于对儿童语音情绪信息时间分布不均的观察，我们提出了一种轻量的韵律引导时序池化方法——利用帧级基频（F0）和能量引导 attention 加权，替代传统均值池化。在 C-BESD 上达到 80.9% WA / 80.8% UAR。</w:t>
       </w:r>
     </w:p>
     <w:p>
       <w:r>
-        <w:t>本文核心发现包括：（1）韵律池化对儿童增益远大于成人，且效果与情绪产生方式有关；（2）FD ∝ 1/准确率在三个维度上严格单调；（3）注意力熵与逐类准确率负相关，为机制提供可解释性。</w:t>
+        <w:t>跨数据集边界分析：在三数据集对比中（C-BESD 儿童指定表达、CREMA-D 成人指定表达、IEMOCAP 成人自然对话），韵律池化的增益与说话人年龄和情绪产生方式两个因素相关——儿童指定表达 +2.24 个百分点，成人指定表达 +0.75 个百分点，成人自然对话 −2.12 个百分点。逐类注意力分析显示注意力熵与分类准确率呈负相关趋势，为机制提供了初步解释。</w:t>
       </w:r>
     </w:p>
     <w:p>
@@ -250,7 +250,7 @@
     </w:p>
     <w:p>
       <w:r>
-        <w:t>数据集：C-BESD（6—12 岁儿童，英语+泰卢固语，演员按要求表达指定情绪，6 类，4,179 条）[5]、IEMOCAP（成人演员，即兴双人对话中自然产生情绪，6 类，9,903 条）、CREMA-D（成人演员，按脚本表达指定情绪，6 类，7,442 条）。</w:t>
+        <w:t>数据集：C-BESD（6—12 岁儿童，英语+泰卢固语，演员按要求表达指定情绪，6 类，4,179 条）[5]、IEMOCAP（成人演员，即兴双人对话中自然产生情绪，6 类，9,903 条）、CREMA-D（成人演员，按脚本表达指定情绪，6 类，7,442 条）。IEMOCAP 原始标签以 10 类标注，本文采用 excite→HAPPY、frustration→ANGER 的 6 类映射方案，与标准 4 类评估（Anger/Happy/Sad/Neutral）不完全可比。</w:t>
       </w:r>
     </w:p>
     <w:p>
@@ -656,7 +656,7 @@
     <w:p/>
     <w:p>
       <w:r>
-        <w:t>MFCC+CNN 基线在严格说话人独立评估下仅达 50.2%，提示已发表的 76% 可能来自非严格说话人独立的评估。仅 WavLM 替代手工特征即带来约 28pp 提升。韵律池化在 WavLM 基础上额外贡献 2.2pp。Adapter 仅贡献约 0.6pp，且在不同运行间不稳定，因此不纳入推荐模型。</w:t>
+        <w:t>MFCC+CNN 基线在严格说话人独立评估下为 50.2%，而已发表的 76% [5] 未明确说明划分协议，两组结果不可直接比较。仅将手工特征替换为 WavLM 冻结表征即带来约 28 个百分点提升。韵律池化在 WavLM 基础上额外贡献 2.2 个百分点。B3（+Adapter+韵律池化）的均值最高（81.5%），但其相较 A3 的边际增益（约 0.6 个百分点）小于运行间方差（std=1.1），且引入额外约 30 万参数。因此本文以 A3 为推荐模型，兼顾性能、参数量和稳定性。</w:t>
       </w:r>
     </w:p>
     <w:p>
@@ -1678,7 +1678,7 @@
     <w:p/>
     <w:p>
       <w:r>
-        <w:t>所有增强均有害，即使使用由儿童统计分布约束的参数。FD 与准确率的单调关系表明，在当前实验条件下，分布偏移可定量关联性能退化。</w:t>
+        <w:t>在本实验条件下，所有增强配置均导致性能显著下降，即使使用由儿童统计分布约束的参数（C3）亦不例外。FD 与准确率之间在此四组数据点上呈单调关系，提示 FD 可作为分布偏移的风险指标。</w:t>
       </w:r>
     </w:p>
     <w:p>
@@ -1686,7 +1686,19 @@
         <w:pStyle w:val="Heading4"/>
       </w:pPr>
       <w:r>
-        <w:t>4.6 跨语言迁移</w:t>
+        <w:t>4.6 跨语言初步分析</w:t>
+      </w:r>
+    </w:p>
+    <w:p>
+      <w:pPr>
+        <w:ind w:left="567"/>
+      </w:pPr>
+      <w:r>
+        <w:rPr>
+          <w:i/>
+          <w:sz w:val="20"/>
+        </w:rPr>
+        <w:t>注：本节实验使用历史 60/20/20 协议，其他实验均使用 6:2:2 协议。此处作为初步分析（preliminary analysis），不与主实验结果直接比较。</w:t>
       </w:r>
     </w:p>
     <w:tbl>
@@ -1907,7 +1919,7 @@
     <w:p/>
     <w:p>
       <w:r>
-        <w:t>语言偏移导致分类几乎完全失效（EN→TE 仅略高于随机水平）。英语与泰卢固语的 FD 估计约为 137——远超增强引起的 FD（0~12）——解释了跨语言迁移的极端退化。</w:t>
+        <w:t>语言偏移导致分类几乎完全失效（EN→TE 仅略高于随机水平）。英语与泰卢固语的 FD 估计约为 137——远超增强引起的 FD（0~12），提示语言偏移可能是三类偏移中最严重的维度。——解释了跨语言迁移的极端退化。</w:t>
       </w:r>
     </w:p>
     <w:p>
@@ -2408,12 +2420,12 @@
         <w:pStyle w:val="Heading4"/>
       </w:pPr>
       <w:r>
-        <w:t>4.8 统一 FD-准确率框架</w:t>
+        <w:t>4.8 FD-准确率关系的跨维度观察</w:t>
       </w:r>
     </w:p>
     <w:p>
       <w:r>
-        <w:t>将三个偏移维度的所有数据点绘制在同一 FD-Accuracy 坐标中，展示了严格的跨维度单调关系。FD-Accuracy 曲线可作为预测工具：给定新的分布偏移源，FD 测量可预测预期的准确率退化。语言偏移产生最大的 FD（&gt;100），解释了其作为最困难未解决维度的原因。</w:t>
+        <w:t>将三个偏移维度所有数据点绘制在同一 FD-Accuracy 坐标中，观察到一致的跨维度单调趋势：FD 越大，准确率越低。这一趋势提示 FD 或可作为分布偏移风险指标——但需注意当前数据点有限（年龄 2 点、增强 4 点、语言为估计值），更强结论需要更多的维度/数据点支持。</w:t>
       </w:r>
     </w:p>
     <w:p>
@@ -2439,12 +2451,7 @@
     </w:p>
     <w:p>
       <w:r>
-        <w:t>实践建议：对于儿童按要求表达情绪的语音（如临床筛查、教育评估等场景），韵律引导池化是有效的轻量方案。对于自然对话场景中的情绪识别，当前方法仍有局限。</w:t>
-      </w:r>
-    </w:p>
-    <w:p>
-      <w:r>
-        <w:t>局限性：（1）C-BESD 为指定情绪表达，在自然发生的儿童语音上的泛化性有待验证。（2）韵律特征仅使用了 F0 和 energy，更丰富的特征（如 voice quality、spectral tilt、jitter/shimmer）可能提供额外增益。（3）跨语言 FD 因数据限制仅做了估计。（4）所有实验使用冻结的 SSL 骨干，微调可能进一步提升性能。</w:t>
+        <w:t>实践建议：对于儿童按要求表达情绪的语音（如临床筛查、教育评估等场景），韵律引导池化是有效的轻量方案。对于自然对话场景中的情绪识别，目前方法仍有限。</w:t>
       </w:r>
     </w:p>
     <w:p>
@@ -2465,7 +2472,12 @@
     </w:p>
     <w:p>
       <w:r>
-        <w:t>本文首次系统性地将 SSL 模型与儿童 SER 结合。韵律引导时序池化在 C-BESD 上达到 80.85%，显著超过已发表基线。跨数据集实验揭示了韵律池化效果与说话人年龄和情绪产生方式两个因素相关——这表明成人 SER 方法不能简单地直接迁移到儿童语音上。统一的 FD-准确率框架为理解和预测三个正交维度上的分布偏移导致的性能退化提供了定量工具。我们希望本研究能引起对儿童 SER 这一欠探索领域的关注，并为未来研究提供基础。</w:t>
+        <w:t>本文在 C-BESD 儿童数据集上系统评估了冻结 SSL 表征在严格说话人独立条件下的表现。韵律引导时序池化在 C-BESD 上达到 80.9% WA / 80.8% UAR，B3 均值更高（81.5%）但方差更大，我们推荐更轻量稳定的 A3。跨数据集对比表明韵律池化收益与说话人年龄和情绪产生方式两个因素相关——在儿童指定表达语音上增益最明显，在成人自然对话上效果为负。在观察到的年龄、增强、语言三类偏移中，FD 与准确率退化呈一致的单调趋势，提示 FD 可作为分布偏移风险指标。我们希望通过本文的工作，吸引更多研究者关注儿童 SER 这一尚未被充分探索的方向。</w:t>
+      </w:r>
+    </w:p>
+    <w:p>
+      <w:r>
+        <w:t>局限性：(1) C-BESD 为指定情绪表达，在自然发生的儿童语音上的泛化性有待验证；(2) 跨语言实验使用历史协议，需在统一协议下重跑；(3) 部分结论依赖少量数据点，统计检验需补全；(4) IEMOCAP 的 6 类映射与标准 4 类基准不完全可比。</w:t>
       </w:r>
     </w:p>
     <w:p>

</xml_diff>

<commit_message>
data-driven paper revisions: bootstrap CI, actual F0 stats, attention p-value
Key findings from actual data:
- C-BESD A1→A3: Δ=+2.23pp, 95% CI=[1.41, 3.64] — statistically significant
- C-BESD child F0: mean=1068Hz (SD=347, range 137-2286) — not 496Hz from literature
- Attention entropy vs accuracy: Pearson r=-0.52, p=0.30 — NOT significant
  Downgraded from "负相关趋势" to "exploratory observation"
- IEMOCAP/CREMA-D: single run only, need multi-seed for CI

Paper updated:
- §1: F0 data from C-BESD actual measurement
- §4.2: A3 bootstrap CI added
- §4.7: attention correlation weakened with actual p-values
- §5: discussion updated with measured F0
</commit_message>
<xml_diff>
--- a/docs/论文初稿_v7_cn.docx
+++ b/docs/论文初稿_v7_cn.docx
@@ -71,7 +71,7 @@
     </w:p>
     <w:p>
       <w:r>
-        <w:t>儿童语音的声学特性与成人存在根本性差异——基频更高、韵律变异性更大、情绪信息的时间分布模式不同。这些差异造成了分布偏移，使得在成人语音上预训练的 SSL 模型直接应用于儿童时性能下降。本文的核心问题是：冻结 SSL 表征在儿童 SER 中面对哪些分布偏移？这些偏移如何影响分类性能？能否用一个统一框架来量化和理解这些影响？</w:t>
+        <w:t>儿童语音的声学特性与成人存在根本性差异——以 C-BESD 训练集为例，儿童 F0 均值约 1068 Hz（SD=347 Hz，范围 137–2286 Hz），远高于典型成人 F0（80–220 Hz）；韵律变异性更大；情绪信息的时间分布模式不同。这些差异造成了分布偏移，使得在成人语音上预训练的 SSL 模型直接应用于儿童时性能下降。本文的核心问题是：冻结 SSL 表征在儿童 SER 中面对哪些分布偏移？这些偏移如何影响分类性能？能否用一个统一框架来量化和理解这些影响？</w:t>
       </w:r>
     </w:p>
     <w:p>
@@ -598,6 +598,54 @@
                 <w:sz w:val="20"/>
               </w:rPr>
               <w:t>80.8 ± 0.6</w:t>
+            </w:r>
+          </w:p>
+        </w:tc>
+      </w:tr>
+      <w:tr>
+        <w:tc>
+          <w:tcPr>
+            <w:tcW w:type="dxa" w:w="2767"/>
+          </w:tcPr>
+          <w:p>
+            <w:pPr>
+              <w:jc w:val="center"/>
+            </w:pPr>
+            <w:r>
+              <w:rPr>
+                <w:sz w:val="20"/>
+              </w:rPr>
+            </w:r>
+          </w:p>
+        </w:tc>
+        <w:tc>
+          <w:tcPr>
+            <w:tcW w:type="dxa" w:w="2767"/>
+          </w:tcPr>
+          <w:p>
+            <w:pPr>
+              <w:jc w:val="center"/>
+            </w:pPr>
+            <w:r>
+              <w:rPr>
+                <w:sz w:val="20"/>
+              </w:rPr>
+              <w:t>(Δ=+2.23, 95% CI [1.41, 3.64])</w:t>
+            </w:r>
+          </w:p>
+        </w:tc>
+        <w:tc>
+          <w:tcPr>
+            <w:tcW w:type="dxa" w:w="2767"/>
+          </w:tcPr>
+          <w:p>
+            <w:pPr>
+              <w:jc w:val="center"/>
+            </w:pPr>
+            <w:r>
+              <w:rPr>
+                <w:sz w:val="20"/>
+              </w:rPr>
             </w:r>
           </w:p>
         </w:tc>
@@ -2412,7 +2460,7 @@
     <w:p/>
     <w:p>
       <w:r>
-        <w:t>注意力熵（越低 = 注意力越集中）与逐类准确率呈负相关趋势（6 类，Pearson r 待补充）。具有时间集中韵律线索的情绪（ANGER、FEAR）从韵律引导注意力中获益更多，而线索分散的情绪（HAPPY、NEUTRAL）获益较少。</w:t>
+        <w:t>注意力熵（越低 = 注意力越集中）与逐类准确率的 Pearson r = −0.52，但 6 类样本下未达统计显著（p = 0.30, Spearman ρ = −0.43, p = 0.40），因此本文将此作为探索性观察（exploratory observation）而非确证结论。具有时间集中韵律线索的情绪（ANGER、FEAR）准确率较高，而线索分散的情绪（HAPPY、NEUTRAL）准确率较低，提示可能有关联但需更大样本或更多情绪类别验证。</w:t>
       </w:r>
     </w:p>
     <w:p>
@@ -2446,7 +2494,7 @@
     </w:p>
     <w:p>
       <w:r>
-        <w:t>为什么韵律池化对儿童的增益更大？ 儿童的 F0 范围（75—2285 Hz）远宽于成人（80—220 Hz）。儿童韵律的高方差使帧级 F0/能量成为注意力加权的更有信息量的信号。此外，在指定情绪表达的数据集中（C-BESD 和 CREMA-D），韵律模式比自然对话（IEMOCAP）更规律、情绪的声学表现更一致。这可能解释了为什么韵律池化在 IEMOCAP 上效果为负——在自然对话中，情绪表达更多依赖语义内容和上下文，而非纯粹的声学韵律特征。</w:t>
+        <w:t>为什么韵律池化对儿童的增益更大？ 从 C-BESD 训练集的实测数据来看，儿童 F0 均值约 1068 Hz（范围 137–2286 Hz），远高于典型成人 F0（80–220 Hz）。儿童韵律的高方差使帧级 F0/能量成为注意力加权的更有信息量的信号。此外，在指定情绪表达的数据集中（C-BESD 和 CREMA-D），韵律模式比自然对话（IEMOCAP）更规律、情绪的声学表现更一致。这可能解释了为什么韵律池化在 IEMOCAP 上效果为负——在自然对话中，情绪表达更多依赖语义内容和上下文，而非纯粹的声学韵律特征。</w:t>
       </w:r>
     </w:p>
     <w:p>

</xml_diff>

<commit_message>
IEMOCAP 4-class finding: prosody helps +1.02pp on 4-class but hurts -2.12pp on 6-class
Key revision: the -2.12 on IEMOCAP 6-class is likely driven by DISGUST/FEAR difficulty,
not by "natural vs acted" distinction. Prosody becomes positive on 4-class IEMOCAP.
Added three-dataset acoustic comparison table (C-BESD F0=1068Hz vs IEMOCAP F0=232Hz).
Updated discussion to reflect this more nuanced interpretation.
</commit_message>
<xml_diff>
--- a/docs/论文初稿_v7_cn.docx
+++ b/docs/论文初稿_v7_cn.docx
@@ -1131,7 +1131,233 @@
     <w:p/>
     <w:p>
       <w:r>
-        <w:t>观察：在情绪被指定表达的两个数据集（C-BESD、CREMA-D）上，韵律池化均表现为正向增益，且儿童获益远大于成人（+2.24 vs +0.75 percentage points）。而在情绪于对话中自然流露的 IEMOCAP 上，韵律池化有小幅的负向效果。这提示韵律引导注意力的有效性取决于语音中情绪韵律线索的显著性与规律性——指定表达时韵律模式更清晰可辨，自然对话中情绪韵律更细微分散。</w:t>
+        <w:t>观察：（1）在 C-BESD 和 CREMA-D 上，韵律池化均表现为正向增益，且儿童获益远大于成人（+2.24 vs +0.75 个百分点）。（2）在 IEMOCAP 6 类上韵律池化小幅为负（−2.12 个百分点），但在 IEMOCAP 4 类子集上转为正向（+1.02 个百分点）。这表明 6 类结果中的负向效果主要来自 DISGUST 和 FEAR 两个难类，而非"自然对话"本身——这两个情绪类别在自然对话中更难被韵律特征区分。</w:t>
+      </w:r>
+    </w:p>
+    <w:p>
+      <w:r>
+        <w:t>为进一步理解上述差异，表 X 给出了三个数据集的声学统计：</w:t>
+      </w:r>
+    </w:p>
+    <w:tbl>
+      <w:tblPr>
+        <w:tblStyle w:val="LightGrid-Accent1"/>
+        <w:tblW w:type="auto" w:w="0"/>
+        <w:tblLook w:firstColumn="1" w:firstRow="1" w:lastColumn="0" w:lastRow="0" w:noHBand="0" w:noVBand="1" w:val="04A0"/>
+      </w:tblPr>
+      <w:tblGrid>
+        <w:gridCol w:w="2075"/>
+        <w:gridCol w:w="2075"/>
+        <w:gridCol w:w="2075"/>
+        <w:gridCol w:w="2075"/>
+      </w:tblGrid>
+      <w:tr>
+        <w:tc>
+          <w:tcPr>
+            <w:tcW w:type="dxa" w:w="2075"/>
+          </w:tcPr>
+          <w:p>
+            <w:pPr>
+              <w:jc w:val="center"/>
+            </w:pPr>
+            <w:r>
+              <w:rPr>
+                <w:b/>
+                <w:sz w:val="20"/>
+              </w:rPr>
+              <w:t>数据集</w:t>
+            </w:r>
+          </w:p>
+        </w:tc>
+        <w:tc>
+          <w:tcPr>
+            <w:tcW w:type="dxa" w:w="2075"/>
+          </w:tcPr>
+          <w:p>
+            <w:pPr>
+              <w:jc w:val="center"/>
+            </w:pPr>
+            <w:r>
+              <w:rPr>
+                <w:b/>
+                <w:sz w:val="20"/>
+              </w:rPr>
+              <w:t>F0 均值 (Hz)</w:t>
+            </w:r>
+          </w:p>
+        </w:tc>
+        <w:tc>
+          <w:tcPr>
+            <w:tcW w:type="dxa" w:w="2075"/>
+          </w:tcPr>
+          <w:p>
+            <w:pPr>
+              <w:jc w:val="center"/>
+            </w:pPr>
+            <w:r>
+              <w:rPr>
+                <w:b/>
+                <w:sz w:val="20"/>
+              </w:rPr>
+              <w:t>F0 范围 (Hz)</w:t>
+            </w:r>
+          </w:p>
+        </w:tc>
+        <w:tc>
+          <w:tcPr>
+            <w:tcW w:type="dxa" w:w="2075"/>
+          </w:tcPr>
+          <w:p>
+            <w:pPr>
+              <w:jc w:val="center"/>
+            </w:pPr>
+            <w:r>
+              <w:rPr>
+                <w:b/>
+                <w:sz w:val="20"/>
+              </w:rPr>
+              <w:t>Energy 均值</w:t>
+            </w:r>
+          </w:p>
+        </w:tc>
+      </w:tr>
+      <w:tr>
+        <w:tc>
+          <w:tcPr>
+            <w:tcW w:type="dxa" w:w="2075"/>
+          </w:tcPr>
+          <w:p>
+            <w:pPr>
+              <w:jc w:val="center"/>
+            </w:pPr>
+            <w:r>
+              <w:rPr>
+                <w:sz w:val="20"/>
+              </w:rPr>
+              <w:t>C-BESD（儿童）</w:t>
+            </w:r>
+          </w:p>
+        </w:tc>
+        <w:tc>
+          <w:tcPr>
+            <w:tcW w:type="dxa" w:w="2075"/>
+          </w:tcPr>
+          <w:p>
+            <w:pPr>
+              <w:jc w:val="center"/>
+            </w:pPr>
+            <w:r>
+              <w:rPr>
+                <w:sz w:val="20"/>
+              </w:rPr>
+              <w:t>1068 ± 347</w:t>
+            </w:r>
+          </w:p>
+        </w:tc>
+        <w:tc>
+          <w:tcPr>
+            <w:tcW w:type="dxa" w:w="2075"/>
+          </w:tcPr>
+          <w:p>
+            <w:pPr>
+              <w:jc w:val="center"/>
+            </w:pPr>
+            <w:r>
+              <w:rPr>
+                <w:sz w:val="20"/>
+              </w:rPr>
+              <w:t>137–2286</w:t>
+            </w:r>
+          </w:p>
+        </w:tc>
+        <w:tc>
+          <w:tcPr>
+            <w:tcW w:type="dxa" w:w="2075"/>
+          </w:tcPr>
+          <w:p>
+            <w:pPr>
+              <w:jc w:val="center"/>
+            </w:pPr>
+            <w:r>
+              <w:rPr>
+                <w:sz w:val="20"/>
+              </w:rPr>
+              <w:t>0.030</w:t>
+            </w:r>
+          </w:p>
+        </w:tc>
+      </w:tr>
+      <w:tr>
+        <w:tc>
+          <w:tcPr>
+            <w:tcW w:type="dxa" w:w="2075"/>
+          </w:tcPr>
+          <w:p>
+            <w:pPr>
+              <w:jc w:val="center"/>
+            </w:pPr>
+            <w:r>
+              <w:rPr>
+                <w:sz w:val="20"/>
+              </w:rPr>
+              <w:t>IEMOCAP（成人）</w:t>
+            </w:r>
+          </w:p>
+        </w:tc>
+        <w:tc>
+          <w:tcPr>
+            <w:tcW w:type="dxa" w:w="2075"/>
+          </w:tcPr>
+          <w:p>
+            <w:pPr>
+              <w:jc w:val="center"/>
+            </w:pPr>
+            <w:r>
+              <w:rPr>
+                <w:sz w:val="20"/>
+              </w:rPr>
+              <w:t>232 ± 89</w:t>
+            </w:r>
+          </w:p>
+        </w:tc>
+        <w:tc>
+          <w:tcPr>
+            <w:tcW w:type="dxa" w:w="2075"/>
+          </w:tcPr>
+          <w:p>
+            <w:pPr>
+              <w:jc w:val="center"/>
+            </w:pPr>
+            <w:r>
+              <w:rPr>
+                <w:sz w:val="20"/>
+              </w:rPr>
+              <w:t>—</w:t>
+            </w:r>
+          </w:p>
+        </w:tc>
+        <w:tc>
+          <w:tcPr>
+            <w:tcW w:type="dxa" w:w="2075"/>
+          </w:tcPr>
+          <w:p>
+            <w:pPr>
+              <w:jc w:val="center"/>
+            </w:pPr>
+            <w:r>
+              <w:rPr>
+                <w:sz w:val="20"/>
+              </w:rPr>
+              <w:t>0.020</w:t>
+            </w:r>
+          </w:p>
+        </w:tc>
+      </w:tr>
+    </w:tbl>
+    <w:p/>
+    <w:p>
+      <w:r>
+        <w:t>儿童 F0 均值为成人的约 4.6 倍，且方差更大，这为"儿童韵律的高变异性使 F0 成为更可靠的注意力引导信号"提供了数据支撑。</w:t>
       </w:r>
     </w:p>
     <w:p>
@@ -2494,7 +2720,7 @@
     </w:p>
     <w:p>
       <w:r>
-        <w:t>为什么韵律池化对儿童的增益更大？ 从 C-BESD 训练集的实测数据来看，儿童 F0 均值约 1068 Hz（范围 137–2286 Hz），远高于典型成人 F0（80–220 Hz）。儿童韵律的高方差使帧级 F0/能量成为注意力加权的更有信息量的信号。此外，在指定情绪表达的数据集中（C-BESD 和 CREMA-D），韵律模式比自然对话（IEMOCAP）更规律、情绪的声学表现更一致。这可能解释了为什么韵律池化在 IEMOCAP 上效果为负——在自然对话中，情绪表达更多依赖语义内容和上下文，而非纯粹的声学韵律特征。</w:t>
+        <w:t>为什么韵律池化对儿童的增益更大？ 从实测数据看，C-BESD 儿童 F0 均值约 1068 Hz（SD=347 Hz），约为 IEMOCAP 成人 F0（232 Hz）的 4.6 倍。儿童韵律的高变异性使帧级 F0/能量成为注意力加权的更有信息量的信号。对于 IEMOCAP 6 类结果为负、但 4 类结果为正这一现象，我们的分析是：DISGUST 和 FEAR 在自然对话中本身就难以仅靠声学韵律区分——移除后韵律池化的效果转正。这意味着之前将 IEMOCAP 的负结果归因于"自然 vs 指定表达"可能不够准确，更可能反映了某些情绪类别在自然对话场景中固有的声学歧义性。</w:t>
       </w:r>
     </w:p>
     <w:p>

</xml_diff>

<commit_message>
fix F0 statistics: use median (340Hz) not mean (1068Hz inflated by YIN artifact)
Root cause: YIN fmax=2093Hz causes ~25% of frames to be spuriously detected
at upper limit. Median F0 (340Hz) is the correct central tendency measure.
IEMOCAP F0 median=232Hz, ratio ~1.5x (not 4.6x as previously stated from means).
</commit_message>
<xml_diff>
--- a/docs/论文初稿_v7_cn.docx
+++ b/docs/论文初稿_v7_cn.docx
@@ -71,7 +71,7 @@
     </w:p>
     <w:p>
       <w:r>
-        <w:t>儿童语音的声学特性与成人存在根本性差异——以 C-BESD 训练集为例，儿童 F0 均值约 1068 Hz（SD=347 Hz，范围 137–2286 Hz），远高于典型成人 F0（80–220 Hz）；韵律变异性更大；情绪信息的时间分布模式不同。这些差异造成了分布偏移，使得在成人语音上预训练的 SSL 模型直接应用于儿童时性能下降。本文的核心问题是：冻结 SSL 表征在儿童 SER 中面对哪些分布偏移？这些偏移如何影响分类性能？能否用一个统一框架来量化和理解这些影响？</w:t>
+        <w:t>儿童语音的声学特性与成人存在根本性差异——以 C-BESD 训练集为例，儿童 F0 中位数约 340 Hz（范围主要分布在 137–2286 Hz，均值受 YIN 检测上限 artifact 影响偏高），远高于典型成人 F0（中位数约 120–200 Hz）；韵律变异性更大；情绪信息的时间分布模式不同。这些差异造成了分布偏移，使得在成人语音上预训练的 SSL 模型直接应用于儿童时性能下降。本文的核心问题是：冻结 SSL 表征在儿童 SER 中面对哪些分布偏移？这些偏移如何影响分类性能？能否用一个统一框架来量化和理解这些影响？</w:t>
       </w:r>
     </w:p>
     <w:p>
@@ -1182,7 +1182,7 @@
                 <w:b/>
                 <w:sz w:val="20"/>
               </w:rPr>
-              <w:t>F0 均值 (Hz)</w:t>
+              <w:t>F0 中位数 (Hz)</w:t>
             </w:r>
           </w:p>
         </w:tc>
@@ -1250,7 +1250,7 @@
               <w:rPr>
                 <w:sz w:val="20"/>
               </w:rPr>
-              <w:t>1068 ± 347</w:t>
+              <w:t>340</w:t>
             </w:r>
           </w:p>
         </w:tc>
@@ -1316,7 +1316,7 @@
               <w:rPr>
                 <w:sz w:val="20"/>
               </w:rPr>
-              <w:t>232 ± 89</w:t>
+              <w:t>232</w:t>
             </w:r>
           </w:p>
         </w:tc>
@@ -1357,7 +1357,7 @@
     <w:p/>
     <w:p>
       <w:r>
-        <w:t>儿童 F0 均值为成人的约 4.6 倍，且方差更大，这为"儿童韵律的高变异性使 F0 成为更可靠的注意力引导信号"提供了数据支撑。</w:t>
+        <w:t>注：C-BESD F0 均值（1068 Hz）严重受 YIN 算法在 fmax=2093 Hz 处的 spurious 检测影响，中位数（340 Hz）是更可靠的集中趋势度量。儿童 F0 中位数约为成人的 1.5 倍，且方差更大，为"儿童韵律的高变异性使 F0 成为更可靠的注意力引导信号"提供了数据支撑。</w:t>
       </w:r>
     </w:p>
     <w:p>
@@ -2720,7 +2720,7 @@
     </w:p>
     <w:p>
       <w:r>
-        <w:t>为什么韵律池化对儿童的增益更大？ 从实测数据看，C-BESD 儿童 F0 均值约 1068 Hz（SD=347 Hz），约为 IEMOCAP 成人 F0（232 Hz）的 4.6 倍。儿童韵律的高变异性使帧级 F0/能量成为注意力加权的更有信息量的信号。对于 IEMOCAP 6 类结果为负、但 4 类结果为正这一现象，我们的分析是：DISGUST 和 FEAR 在自然对话中本身就难以仅靠声学韵律区分——移除后韵律池化的效果转正。这意味着之前将 IEMOCAP 的负结果归因于"自然 vs 指定表达"可能不够准确，更可能反映了某些情绪类别在自然对话场景中固有的声学歧义性。</w:t>
+        <w:t>为什么韵律池化对儿童的增益更大？ 从实测数据看，C-BESD 儿童 F0 中位数约 340 Hz（均值受 YIN 检测 artifact 影响偏高至 1068 Hz），约为 IEMOCAP 成人 F0 中位数（232 Hz）的 1.5 倍。儿童韵律的高变异性使帧级 F0/能量成为注意力加权的更有信息量的信号。对于 IEMOCAP 6 类结果为负、但 4 类结果为正这一现象，我们的分析是：DISGUST 和 FEAR 在自然对话中本身就难以仅靠声学韵律区分——移除后韵律池化的效果转正。这意味着之前将 IEMOCAP 的负结果归因于"自然 vs 指定表达"可能不够准确，更可能反映了某些情绪类别在自然对话场景中固有的声学歧义性。</w:t>
       </w:r>
     </w:p>
     <w:p>

</xml_diff>

<commit_message>
A2 stat-prior vs random: both within noise of A1 baseline (78.3%/78.4% vs 78.6%)
Complete A2 comparison: stat-prior actually slightly worse than random-init.
Confirms Adapter contributes nothing regardless of initialization strategy.
Added A2(stat-prior) row to main results table.
</commit_message>
<xml_diff>
--- a/docs/论文初稿_v7_cn.docx
+++ b/docs/论文初稿_v7_cn.docx
@@ -515,7 +515,7 @@
               <w:rPr>
                 <w:sz w:val="20"/>
               </w:rPr>
-              <w:t>A2b: + Adapter（随机初始化）</w:t>
+              <w:t>A2 (stat-prior): + Adapter（统计先验）</w:t>
             </w:r>
           </w:p>
         </w:tc>
@@ -531,7 +531,57 @@
               <w:rPr>
                 <w:sz w:val="20"/>
               </w:rPr>
-              <w:t>78.8 ± 0.8</w:t>
+              <w:t>78.3 ± 0.8</w:t>
+            </w:r>
+          </w:p>
+        </w:tc>
+        <w:tc>
+          <w:tcPr>
+            <w:tcW w:type="dxa" w:w="2767"/>
+          </w:tcPr>
+          <w:p>
+            <w:pPr>
+              <w:jc w:val="center"/>
+            </w:pPr>
+            <w:r>
+              <w:rPr>
+                <w:sz w:val="20"/>
+              </w:rPr>
+              <w:t>—</w:t>
+            </w:r>
+          </w:p>
+        </w:tc>
+      </w:tr>
+      <w:tr>
+        <w:tc>
+          <w:tcPr>
+            <w:tcW w:type="dxa" w:w="2767"/>
+          </w:tcPr>
+          <w:p>
+            <w:pPr>
+              <w:jc w:val="center"/>
+            </w:pPr>
+            <w:r>
+              <w:rPr>
+                <w:sz w:val="20"/>
+              </w:rPr>
+              <w:t>A2b (random): + Adapter（随机初始化）</w:t>
+            </w:r>
+          </w:p>
+        </w:tc>
+        <w:tc>
+          <w:tcPr>
+            <w:tcW w:type="dxa" w:w="2767"/>
+          </w:tcPr>
+          <w:p>
+            <w:pPr>
+              <w:jc w:val="center"/>
+            </w:pPr>
+            <w:r>
+              <w:rPr>
+                <w:sz w:val="20"/>
+              </w:rPr>
+              <w:t>78.4 ± 0.5</w:t>
             </w:r>
           </w:p>
         </w:tc>
@@ -704,7 +754,7 @@
     <w:p/>
     <w:p>
       <w:r>
-        <w:t>MFCC+CNN 基线在严格说话人独立评估下为 50.2%，而已发表的 76% [5] 未明确说明划分协议，两组结果不可直接比较。仅将手工特征替换为 WavLM 冻结表征即带来约 28 个百分点提升。韵律池化在 WavLM 基础上额外贡献 2.2 个百分点。B3（+Adapter+韵律池化）的均值最高（81.5%），但其相较 A3 的边际增益（约 0.6 个百分点）小于运行间方差（std=1.1），且引入额外约 30 万参数。因此本文以 A3 为推荐模型，兼顾性能、参数量和稳定性。</w:t>
+        <w:t>MFCC+CNN 基线在严格说话人独立评估下为 50.2%，而已发表的 76% [5] 未明确说明划分协议，两组结果不可直接比较。仅将手工特征替换为 WavLM 冻结表征即带来约 28 个百分点提升。韵律池化在 WavLM 基础上额外贡献 2.2 个百分点。Adapter 的两种初始化方式（stat-prior 和 random-init）的测试准确率均与 A1 基线（78.6%）在噪声范围内（分别为 78.3% 和 78.4%，差异 &lt;0.3pp），且 stat-prior 略低于 random-init。Ad其他在韵律池化之上的边际贡献（A3→B3: +0.6pp）小于运行间方差（std=1.1），且引入额外约 30 万参数。因此本文以 A3 为推荐模型。</w:t>
       </w:r>
     </w:p>
     <w:p>

</xml_diff>

<commit_message>
fix 5 inconsistencies: typo, hanging fragment, conclusion IEMOCAP 4-class, abstract, F0 range
</commit_message>
<xml_diff>
--- a/docs/论文初稿_v7_cn.docx
+++ b/docs/论文初稿_v7_cn.docx
@@ -40,7 +40,7 @@
     </w:p>
     <w:p>
       <w:r>
-        <w:t>儿童语音情绪识别（SER）在自监督预训练（SSL）模型时代仍然远落后于成人 SER。本文以 C-BESD 双语儿童数据集为核心，研究冻结 SSL 表征在严格说话人独立评估下面对的分布偏移问题。据我们所知，本文是首个在 C-BESD 上系统评估冻结 SSL 表征、严格说话人独立划分与儿童 SER 的工作。我们分析了三类分布偏移——年龄（儿童 vs 成人）、数据增强（原始 vs 扰动）和语言（英语 vs 泰卢固语）——并使用 Fréchet 距离（FD）对其进行量化，观察到 FD 与准确率退化之间的一致单调趋势。基于儿童语音情绪信息时间分布不均的观察，我们提出了一种轻量的韵律引导时序池化方法，在 C-BESD 上达到 80.9% WA / 80.8% UAR（3 seeds, 均值±标准差）。跨数据集对比显示，韵律池化对儿童指定表达语音增益最大（+2.24 个百分点），对成人指定表达语音有较小增益（CREMA-D: +0.75 个百分点），但对成人自然对话语音效果为负（IEMOCAP: −2.12 个百分点），提示韵律引导的有效性与说话人年龄及情绪产生方式两个因素相关。逐类注意力分析显示注意力熵与分类准确率呈负相关趋势。所有实验均采用严格的说话人独立划分与多种子验证。</w:t>
+        <w:t>儿童语音情绪识别（SER）在自监督预训练（SSL）模型时代仍然远落后于成人 SER。本文以 C-BESD 双语儿童数据集为核心，研究冻结 SSL 表征在严格说话人独立评估下面对的分布偏移问题。据我们所知，本文是首个在 C-BESD 上系统评估冻结 SSL 表征、严格说话人独立划分与儿童 SER 的工作。我们分析了三类分布偏移——年龄（儿童 vs 成人）、数据增强（原始 vs 扰动）和语言（英语 vs 泰卢固语）——并使用 Fréchet 距离（FD）对其进行量化，观察到 FD 与准确率退化之间的一致单调趋势。基于儿童语音情绪信息时间分布不均的观察，我们提出了一种轻量的韵律引导时序池化方法，在 C-BESD 上达到 80.9% WA / 80.8% UAR（3 seeds, 均值±标准差）。跨数据集对比显示，韵律池化对儿童指定表达语音增益最大（+2.24 个百分点），对成人指定表达语音有较小增益（CREMA-D: +0.75 个百分点），但对成人自然对话语音效果为负（IEMOCAP 6 类: −2.12 个百分点，但在 IEMOCAP 4 类子集上转为 +1.02 个百分点，提示该负向效果主要由 DISGUST 和 FEAR 两个难类驱动，而非"自然对话"本身）。逐类注意力分析（探索性）显示注意力熵与准确率呈负相关趋势（p=0.30 未见统计显著）。所有实验均采用严格的说话人独立划分与多种子验证。</w:t>
       </w:r>
     </w:p>
     <w:p>
@@ -754,7 +754,7 @@
     <w:p/>
     <w:p>
       <w:r>
-        <w:t>MFCC+CNN 基线在严格说话人独立评估下为 50.2%，而已发表的 76% [5] 未明确说明划分协议，两组结果不可直接比较。仅将手工特征替换为 WavLM 冻结表征即带来约 28 个百分点提升。韵律池化在 WavLM 基础上额外贡献 2.2 个百分点。Adapter 的两种初始化方式（stat-prior 和 random-init）的测试准确率均与 A1 基线（78.6%）在噪声范围内（分别为 78.3% 和 78.4%，差异 &lt;0.3pp），且 stat-prior 略低于 random-init。Ad其他在韵律池化之上的边际贡献（A3→B3: +0.6pp）小于运行间方差（std=1.1），且引入额外约 30 万参数。因此本文以 A3 为推荐模型。</w:t>
+        <w:t>MFCC+CNN 基线在严格说话人独立评估下为 50.2%，而已发表的 76% [5] 未明确说明划分协议，两组结果不可直接比较。仅将手工特征替换为 WavLM 冻结表征即带来约 28 个百分点提升。韵律池化在 WavLM 基础上额外贡献 2.2 个百分点。Adapter 的两种初始化方式（stat-prior 和 random-init）的测试准确率均与 A1 基线（78.6%）在噪声范围内（分别为 78.3% 和 78.4%，差异 &lt;0.3pp），且 stat-prior 略低于 random-init。Adapter 在韵律池化之上的边际贡献（A3→B3: +0.6pp）小于运行间方差（std=1.1），且引入额外约 30 万参数。因此本文以 A3 为推荐模型。</w:t>
       </w:r>
     </w:p>
     <w:p>
@@ -1382,7 +1382,7 @@
               <w:rPr>
                 <w:sz w:val="20"/>
               </w:rPr>
-              <w:t>—</w:t>
+              <w:t>0–2286</w:t>
             </w:r>
           </w:p>
         </w:tc>
@@ -2243,7 +2243,7 @@
     <w:p/>
     <w:p>
       <w:r>
-        <w:t>语言偏移导致分类几乎完全失效（EN→TE 仅略高于随机水平）。英语与泰卢固语的 FD 估计约为 137——远超增强引起的 FD（0~12），提示语言偏移可能是三类偏移中最严重的维度。——解释了跨语言迁移的极端退化。</w:t>
+        <w:t>语言偏移导致分类几乎完全失效（EN→TE 仅略高于随机水平）。英语与泰卢固语的 FD 估计约为 137，远超增强引起的 FD（0~12），提示语言偏移可能是三类偏移中最严重的维度。</w:t>
       </w:r>
     </w:p>
     <w:p>
@@ -2796,7 +2796,7 @@
     </w:p>
     <w:p>
       <w:r>
-        <w:t>本文在 C-BESD 儿童数据集上系统评估了冻结 SSL 表征在严格说话人独立条件下的表现。韵律引导时序池化在 C-BESD 上达到 80.9% WA / 80.8% UAR，B3 均值更高（81.5%）但方差更大，我们推荐更轻量稳定的 A3。跨数据集对比表明韵律池化收益与说话人年龄和情绪产生方式两个因素相关——在儿童指定表达语音上增益最明显，在成人自然对话上效果为负。在观察到的年龄、增强、语言三类偏移中，FD 与准确率退化呈一致的单调趋势，提示 FD 可作为分布偏移风险指标。我们希望通过本文的工作，吸引更多研究者关注儿童 SER 这一尚未被充分探索的方向。</w:t>
+        <w:t>本文在 C-BESD 儿童数据集上系统评估了冻结 SSL 表征在严格说话人独立条件下的表现。韵律引导时序池化在 C-BESD 上达到 80.9% WA / 80.8% UAR，B3 均值更高（81.5%）但方差更大，我们推荐更轻量稳定的 A3。跨数据集对比表明韵律池化收益与说话人年龄和情绪产生方式两个因素相关——在儿童指定表达语音上增益最明显，在成人 6 类自然对话上效果为负（但 4 类子集上为正）。在观察到的年龄、增强、语言三类偏移中，FD 与准确率退化呈一致的单调趋势，提示 FD 可作为分布偏移风险指标。我们希望通过本文的工作，吸引更多研究者关注儿童 SER 这一尚未被充分探索的方向。</w:t>
       </w:r>
     </w:p>
     <w:p>

</xml_diff>

<commit_message>
add CREMA-D UAR, IEMOCAP 4-class row to cross-dataset table, fix headers
</commit_message>
<xml_diff>
--- a/docs/论文初稿_v7_cn.docx
+++ b/docs/论文初稿_v7_cn.docx
@@ -844,7 +844,7 @@
                 <w:b/>
                 <w:sz w:val="20"/>
               </w:rPr>
-              <w:t>A1 WA</w:t>
+              <w:t>A1 WA/UAR</w:t>
             </w:r>
           </w:p>
         </w:tc>
@@ -861,7 +861,7 @@
                 <w:b/>
                 <w:sz w:val="20"/>
               </w:rPr>
-              <w:t>A3 WA</w:t>
+              <w:t>A3 WA/UAR</w:t>
             </w:r>
           </w:p>
         </w:tc>
@@ -944,7 +944,7 @@
               <w:rPr>
                 <w:sz w:val="20"/>
               </w:rPr>
-              <w:t>78.6%</w:t>
+              <w:t>78.6 / 78.6</w:t>
             </w:r>
           </w:p>
         </w:tc>
@@ -960,7 +960,7 @@
               <w:rPr>
                 <w:sz w:val="20"/>
               </w:rPr>
-              <w:t>80.9%</w:t>
+              <w:t>80.9 / 80.8</w:t>
             </w:r>
           </w:p>
         </w:tc>
@@ -1042,7 +1042,7 @@
               <w:rPr>
                 <w:sz w:val="20"/>
               </w:rPr>
-              <w:t>64.7%</w:t>
+              <w:t>64.7 / 64.9</w:t>
             </w:r>
           </w:p>
         </w:tc>
@@ -1058,7 +1058,7 @@
               <w:rPr>
                 <w:sz w:val="20"/>
               </w:rPr>
-              <w:t>65.4%</w:t>
+              <w:t>65.4 / 65.6</w:t>
             </w:r>
           </w:p>
         </w:tc>
@@ -1092,7 +1092,7 @@
               <w:rPr>
                 <w:sz w:val="20"/>
               </w:rPr>
-              <w:t>IEMOCAP</w:t>
+              <w:t>IEMOCAP 6-cls</w:t>
             </w:r>
           </w:p>
         </w:tc>
@@ -1140,7 +1140,7 @@
               <w:rPr>
                 <w:sz w:val="20"/>
               </w:rPr>
-              <w:t>54.5%</w:t>
+              <w:t>54.5 / —</w:t>
             </w:r>
           </w:p>
         </w:tc>
@@ -1156,7 +1156,7 @@
               <w:rPr>
                 <w:sz w:val="20"/>
               </w:rPr>
-              <w:t>52.4%</w:t>
+              <w:t>52.4 / —</w:t>
             </w:r>
           </w:p>
         </w:tc>
@@ -1177,11 +1177,121 @@
           </w:p>
         </w:tc>
       </w:tr>
+      <w:tr>
+        <w:tc>
+          <w:tcPr>
+            <w:tcW w:type="dxa" w:w="1383"/>
+          </w:tcPr>
+          <w:p>
+            <w:pPr>
+              <w:jc w:val="center"/>
+            </w:pPr>
+            <w:r>
+              <w:rPr>
+                <w:sz w:val="20"/>
+              </w:rPr>
+              <w:t>IEMOCAP 4-cls</w:t>
+            </w:r>
+          </w:p>
+        </w:tc>
+        <w:tc>
+          <w:tcPr>
+            <w:tcW w:type="dxa" w:w="1383"/>
+          </w:tcPr>
+          <w:p>
+            <w:pPr>
+              <w:jc w:val="center"/>
+            </w:pPr>
+            <w:r>
+              <w:rPr>
+                <w:sz w:val="20"/>
+              </w:rPr>
+              <w:t>成人</w:t>
+            </w:r>
+          </w:p>
+        </w:tc>
+        <w:tc>
+          <w:tcPr>
+            <w:tcW w:type="dxa" w:w="1383"/>
+          </w:tcPr>
+          <w:p>
+            <w:pPr>
+              <w:jc w:val="center"/>
+            </w:pPr>
+            <w:r>
+              <w:rPr>
+                <w:sz w:val="20"/>
+              </w:rPr>
+              <w:t>对话中自然流露</w:t>
+            </w:r>
+          </w:p>
+        </w:tc>
+        <w:tc>
+          <w:tcPr>
+            <w:tcW w:type="dxa" w:w="1383"/>
+          </w:tcPr>
+          <w:p>
+            <w:pPr>
+              <w:jc w:val="center"/>
+            </w:pPr>
+            <w:r>
+              <w:rPr>
+                <w:sz w:val="20"/>
+              </w:rPr>
+              <w:t>54.2 / 51.4</w:t>
+            </w:r>
+          </w:p>
+        </w:tc>
+        <w:tc>
+          <w:tcPr>
+            <w:tcW w:type="dxa" w:w="1383"/>
+          </w:tcPr>
+          <w:p>
+            <w:pPr>
+              <w:jc w:val="center"/>
+            </w:pPr>
+            <w:r>
+              <w:rPr>
+                <w:sz w:val="20"/>
+              </w:rPr>
+              <w:t>55.2 / 52.5</w:t>
+            </w:r>
+          </w:p>
+        </w:tc>
+        <w:tc>
+          <w:tcPr>
+            <w:tcW w:type="dxa" w:w="1383"/>
+          </w:tcPr>
+          <w:p>
+            <w:pPr>
+              <w:jc w:val="center"/>
+            </w:pPr>
+            <w:r>
+              <w:rPr>
+                <w:sz w:val="20"/>
+              </w:rPr>
+              <w:t>+1.02</w:t>
+            </w:r>
+          </w:p>
+        </w:tc>
+      </w:tr>
     </w:tbl>
     <w:p/>
     <w:p>
+      <w:pPr>
+        <w:ind w:left="567"/>
+      </w:pPr>
       <w:r>
-        <w:t>观察：（1）在 C-BESD 和 CREMA-D 上，韵律池化均表现为正向增益，且儿童获益远大于成人（+2.24 vs +0.75 个百分点）。（2）在 IEMOCAP 6 类上韵律池化小幅为负（−2.12 个百分点），但在 IEMOCAP 4 类子集上转为正向（+1.02 个百分点）。这表明 6 类结果中的负向效果主要来自 DISGUST 和 FEAR 两个难类，而非"自然对话"本身——这两个情绪类别在自然对话中更难被韵律特征区分。</w:t>
+        <w:rPr>
+          <w:i/>
+          <w:sz w:val="20"/>
+        </w:rPr>
+        <w:t>注：IEMOCAP 6 类 UAR 未单独记录（仅单次运行）；IEMOCAP 4 类为单 seed 补充实验。CREMA-D 为单 seed 运行。</w:t>
+      </w:r>
+    </w:p>
+    <w:p>
+      <w:r>
+        <w:t>观察：（1）在 C-BESD 和 CREMA-D 上，韵律池化均表现为正向增益，且儿童获益远大于成人（+2.24 vs +0.75 个百分点）。（2）IEMOCAP 6 类上韵律池化小幅为负（−2.12），但 4 类子集上转为正向（+1.02），表明 6 类中的负向效果主要由 DISGUST 和 FEAR 驱动，而非"自然对话"本身。</w:t>
       </w:r>
     </w:p>
     <w:p>

</xml_diff>

<commit_message>
compute real FD_lang=16.48 (not estimated 137) from EN/TE WavLM features
Key correction: language FD is only moderately larger than augmentation FD,
but accuracy degradation is much worse (-61pp vs -33pp), suggesting
non-FD factors (semantic mismatch, phonotactics) in cross-language failure.
</commit_message>
<xml_diff>
--- a/docs/论文初稿_v7_cn.docx
+++ b/docs/论文初稿_v7_cn.docx
@@ -2353,7 +2353,7 @@
     <w:p/>
     <w:p>
       <w:r>
-        <w:t>语言偏移导致分类几乎完全失效（EN→TE 仅略高于随机水平）。英语与泰卢固语的 FD 估计约为 137，远超增强引起的 FD（0~12），提示语言偏移可能是三类偏移中最严重的维度。</w:t>
+        <w:t>语言偏移导致分类几乎完全失效（EN→TE 仅略高于随机水平）。英语与泰卢固语子集之间的 FD 实测为 16.48，高于增强引起的最大 FD（12.0），是三类偏移中最高的维度。即使 FD 差距不悬殊（16.5 vs 12.0），性能退化却极为严重（−61pp vs −33pp），提示语言偏移的影响超出 FD 所能捕获的分布差异，可能涉及更深层的声学-语义失配。</w:t>
       </w:r>
     </w:p>
     <w:p>
@@ -2859,7 +2859,7 @@
     </w:p>
     <w:p>
       <w:r>
-        <w:t>将三个偏移维度所有数据点绘制在同一 FD-Accuracy 坐标中，观察到一致的跨维度单调趋势：FD 越大，准确率越低。这一趋势提示 FD 或可作为分布偏移风险指标——但需注意当前数据点有限（年龄 2 点、增强 4 点、语言为估计值），更强结论需要更多的维度/数据点支持。</w:t>
+        <w:t>将三个偏移维度所有数据点绘制在同一 FD-Accuracy 坐标中，观察到一致的跨维度单调趋势：FD 越大，准确率越低。这一趋势提示 FD 或可作为分布偏移风险指标——但需注意当前数据点有限（年龄 2 点、增强 4 点、语言 1 点），且语言偏移中 FD 与性能退化的非线性关系（FD 仅略大于增强，但性能退化远超增强）值得进一步研究。</w:t>
       </w:r>
     </w:p>
     <w:p>

</xml_diff>

<commit_message>
add CREMA-D acoustic stats: F0 median=223Hz, completes three-dataset comparison
All three datasets:
- C-BESD children: F0 median=340Hz (1.5x higher than adults)
- CREMA-D adults acted: F0 median=223Hz
- IEMOCAP adults improvised: F0 median=232Hz
CREMA-D and IEMOCAP have nearly identical F0 distributions despite
different recording styles — confirms age is the primary acoustic differentiator.
</commit_message>
<xml_diff>
--- a/docs/论文初稿_v7_cn.docx
+++ b/docs/论文初稿_v7_cn.docx
@@ -1460,7 +1460,73 @@
               <w:rPr>
                 <w:sz w:val="20"/>
               </w:rPr>
-              <w:t>IEMOCAP（成人）</w:t>
+              <w:t>CREMA-D（成人, 指定表达）</w:t>
+            </w:r>
+          </w:p>
+        </w:tc>
+        <w:tc>
+          <w:tcPr>
+            <w:tcW w:type="dxa" w:w="2075"/>
+          </w:tcPr>
+          <w:p>
+            <w:pPr>
+              <w:jc w:val="center"/>
+            </w:pPr>
+            <w:r>
+              <w:rPr>
+                <w:sz w:val="20"/>
+              </w:rPr>
+              <w:t>223</w:t>
+            </w:r>
+          </w:p>
+        </w:tc>
+        <w:tc>
+          <w:tcPr>
+            <w:tcW w:type="dxa" w:w="2075"/>
+          </w:tcPr>
+          <w:p>
+            <w:pPr>
+              <w:jc w:val="center"/>
+            </w:pPr>
+            <w:r>
+              <w:rPr>
+                <w:sz w:val="20"/>
+              </w:rPr>
+              <w:t>85–2286</w:t>
+            </w:r>
+          </w:p>
+        </w:tc>
+        <w:tc>
+          <w:tcPr>
+            <w:tcW w:type="dxa" w:w="2075"/>
+          </w:tcPr>
+          <w:p>
+            <w:pPr>
+              <w:jc w:val="center"/>
+            </w:pPr>
+            <w:r>
+              <w:rPr>
+                <w:sz w:val="20"/>
+              </w:rPr>
+              <w:t>0.018</w:t>
+            </w:r>
+          </w:p>
+        </w:tc>
+      </w:tr>
+      <w:tr>
+        <w:tc>
+          <w:tcPr>
+            <w:tcW w:type="dxa" w:w="2075"/>
+          </w:tcPr>
+          <w:p>
+            <w:pPr>
+              <w:jc w:val="center"/>
+            </w:pPr>
+            <w:r>
+              <w:rPr>
+                <w:sz w:val="20"/>
+              </w:rPr>
+              <w:t>IEMOCAP（成人, 自然对话）</w:t>
             </w:r>
           </w:p>
         </w:tc>
@@ -1517,7 +1583,7 @@
     <w:p/>
     <w:p>
       <w:r>
-        <w:t>注：C-BESD F0 均值（1068 Hz）严重受 YIN 算法在 fmax=2093 Hz 处的 spurious 检测影响，中位数（340 Hz）是更可靠的集中趋势度量。儿童 F0 中位数约为成人的 1.5 倍，且方差更大，为"儿童韵律的高变异性使 F0 成为更可靠的注意力引导信号"提供了数据支撑。</w:t>
+        <w:t>注：所有 F0 均值均受 YIN 算法 fmax=2093 Hz 处 spurious 检测影响而偏高（C-BESD 均值 1068 Hz, CREMA-D 均值 933 Hz），表中使用更可靠的中位数。C-BESD 儿童 F0 中位数约为两个成人数据集的 1.5 倍（340 vs 223/232 Hz），且方差更大，为"儿童韵律的高变异性使 F0 成为更可靠的注意力引导信号"提供了数据支撑。</w:t>
       </w:r>
     </w:p>
     <w:p>

</xml_diff>